<commit_message>
qr code pasport pallet
</commit_message>
<xml_diff>
--- a/apps/printing/docx/pallet_passport.docx
+++ b/apps/printing/docx/pallet_passport.docx
@@ -13,6 +13,51 @@
         <w:gridCol w:w="3118"/>
         <w:gridCol w:w="7654"/>
       </w:tblGrid>
+      <w:tr>
+        <w:trPr>
+          <w:trHeight w:val="800" w:hRule="atLeast"/>
+        </w:trPr>
+        <w:tc>
+          <w:tcPr>
+            <w:tcW w:type="dxa" w:w="3118"/>
+            <w:vAlign w:val="center"/>
+          </w:tcPr>
+          <w:p>
+            <w:pPr>
+              <w:spacing w:before="0" w:after="0"/>
+              <w:jc w:val="left"/>
+            </w:pPr>
+            <w:r>
+              <w:rPr>
+                <w:rFonts w:ascii="Calibri" w:hAnsi="Calibri" w:cs="Calibri" w:eastAsia="Calibri"/>
+                <w:b/>
+                <w:sz w:val="36"/>
+              </w:rPr>
+              <w:t>Номер</w:t>
+            </w:r>
+          </w:p>
+        </w:tc>
+        <w:tc>
+          <w:tcPr>
+            <w:tcW w:type="dxa" w:w="7654"/>
+            <w:vAlign w:val="center"/>
+          </w:tcPr>
+          <w:p>
+            <w:pPr>
+              <w:spacing w:before="0" w:after="0"/>
+              <w:jc w:val="left"/>
+            </w:pPr>
+            <w:r>
+              <w:rPr>
+                <w:rFonts w:ascii="Calibri" w:hAnsi="Calibri" w:cs="Calibri" w:eastAsia="Calibri"/>
+                <w:b/>
+                <w:sz w:val="44"/>
+              </w:rPr>
+              <w:t>{{ number }}</w:t>
+            </w:r>
+          </w:p>
+        </w:tc>
+      </w:tr>
       <w:tr>
         <w:trPr>
           <w:trHeight w:val="800" w:hRule="atLeast"/>
@@ -434,6 +479,51 @@
         <w:gridCol w:w="3118"/>
         <w:gridCol w:w="7654"/>
       </w:tblGrid>
+      <w:tr>
+        <w:trPr>
+          <w:trHeight w:val="800" w:hRule="atLeast"/>
+        </w:trPr>
+        <w:tc>
+          <w:tcPr>
+            <w:tcW w:type="dxa" w:w="3118"/>
+            <w:vAlign w:val="center"/>
+          </w:tcPr>
+          <w:p>
+            <w:pPr>
+              <w:spacing w:before="0" w:after="0"/>
+              <w:jc w:val="left"/>
+            </w:pPr>
+            <w:r>
+              <w:rPr>
+                <w:rFonts w:ascii="Calibri" w:hAnsi="Calibri" w:cs="Calibri" w:eastAsia="Calibri"/>
+                <w:b/>
+                <w:sz w:val="36"/>
+              </w:rPr>
+              <w:t>Номер</w:t>
+            </w:r>
+          </w:p>
+        </w:tc>
+        <w:tc>
+          <w:tcPr>
+            <w:tcW w:type="dxa" w:w="7654"/>
+            <w:vAlign w:val="center"/>
+          </w:tcPr>
+          <w:p>
+            <w:pPr>
+              <w:spacing w:before="0" w:after="0"/>
+              <w:jc w:val="left"/>
+            </w:pPr>
+            <w:r>
+              <w:rPr>
+                <w:rFonts w:ascii="Calibri" w:hAnsi="Calibri" w:cs="Calibri" w:eastAsia="Calibri"/>
+                <w:b/>
+                <w:sz w:val="44"/>
+              </w:rPr>
+              <w:t>{{ number }}</w:t>
+            </w:r>
+          </w:p>
+        </w:tc>
+      </w:tr>
       <w:tr>
         <w:trPr>
           <w:trHeight w:val="800" w:hRule="atLeast"/>

</xml_diff>